<commit_message>
docs(app): publish reviewed platform guides and release evidence
</commit_message>
<xml_diff>
--- a/output/docx/luma-green-launch-test-plan.docx
+++ b/output/docx/luma-green-launch-test-plan.docx
@@ -16,7 +16,7 @@
         <w:ind w:left="202"/>
       </w:pPr>
       <w:r>
-        <w:t>Status: approved work plan; test execution pending. Prepared 6 October 2026. Target decision: Saturday 10 October 2026, Asia/Kolkata. Owners: founder, test lead and engineer. Assign named people before the first run.</w:t>
+        <w:t>Status: approved work plan; local execution in progress. Updated 7 October 2026. Target decision: Saturday 10 October 2026, Asia/Kolkata. Owners: founder, test lead and engineer. Assign named people before the first run.</w:t>
       </w:r>
     </w:p>
     <w:p>
@@ -26,7 +26,7 @@
     </w:p>
     <w:p>
       <w:r>
-        <w:t>The engineer may continue the approved implementation without another plan approval. This document does not report completed acceptance tests. The approved normal-user methods are verified email/password and phone OTP. All development verification and disposable accounts in this test pass must remain local.</w:t>
+        <w:t>The engineer may continue the approved implementation without another plan approval. Section 13 records the completed checks and the remaining gates. The approved normal-user methods are verified email/password and phone OTP. All development verification and disposable accounts in this test pass must remain local.</w:t>
       </w:r>
     </w:p>
     <w:p>
@@ -70,7 +70,7 @@
         <w:pStyle w:val="ListBullet"/>
       </w:pPr>
       <w:r>
-        <w:t>Email signup, workspace permissions and invitations are under implementation. Full role browser acceptance has not run. Earlier fixture captures and older test totals are historical evidence only.</w:t>
+        <w:t>Email signup, workspace permissions, invitations and lot/quality screens are implemented in the integration worktree. The complete post-bridge suite passed 55 of 55 browser cases against the local production build on 7 October. Both TypeScript checks passed; final capture review, guide rebuild, whole-project checks, CI and release checks remain in progress. Section 13 records the scope of each result. Earlier fixture captures do not prove current authenticated behavior.</w:t>
       </w:r>
     </w:p>
     <w:p>
@@ -86,7 +86,7 @@
         <w:pStyle w:val="ListBullet"/>
       </w:pPr>
       <w:r>
-        <w:t>B2B payments require a selected, integrated gateway. No provider is selected. Local tests must confirm that payment-dependent actions stay blocked. A manual paid flag, uploaded proof or simulated escrow must not unlock them.</w:t>
+        <w:t>Cashfree Payment Gateway with Easy Split was selected on 6 October under the founder's delegated choice. Sandbox and guarded live checkout, delivery, refund and settlement controls are implemented. The backend passed 137 focused tests and independent review; the UI passed 50 focused tests, and the combined local browser suite passed 55 of 55 cases. Provider eligibility, real provider acceptance and activation remain pending. Local tests must confirm that payment-dependent actions stay blocked. A manual paid flag, uploaded proof or simulated escrow must not unlock them.</w:t>
       </w:r>
     </w:p>
     <w:p>
@@ -107,7 +107,6 @@
       <w:hyperlink r:id="rId9">
         <w:r>
           <w:rPr>
-            <w:color w:val="175C73"/>
             <w:u w:val="single"/>
           </w:rPr>
           <w:t>requirements record</w:t>
@@ -119,7 +118,6 @@
       <w:hyperlink r:id="rId10">
         <w:r>
           <w:rPr>
-            <w:color w:val="175C73"/>
             <w:u w:val="single"/>
           </w:rPr>
           <w:t>gateway decision</w:t>
@@ -159,6 +157,8 @@
       </w:tblGrid>
       <w:tr>
         <w:trPr>
+          <w:cantSplit/>
+          <w:tblHeader/>
           <w:cantSplit/>
           <w:tblHeader/>
         </w:trPr>
@@ -220,6 +220,7 @@
       <w:tr>
         <w:trPr>
           <w:cantSplit/>
+          <w:cantSplit/>
         </w:trPr>
         <w:tc>
           <w:tcPr>
@@ -278,6 +279,7 @@
       </w:tr>
       <w:tr>
         <w:trPr>
+          <w:cantSplit/>
           <w:cantSplit/>
         </w:trPr>
         <w:tc>
@@ -338,6 +340,7 @@
       <w:tr>
         <w:trPr>
           <w:cantSplit/>
+          <w:cantSplit/>
         </w:trPr>
         <w:tc>
           <w:tcPr>
@@ -397,6 +400,7 @@
       <w:tr>
         <w:trPr>
           <w:cantSplit/>
+          <w:cantSplit/>
         </w:trPr>
         <w:tc>
           <w:tcPr>
@@ -455,6 +459,7 @@
       </w:tr>
       <w:tr>
         <w:trPr>
+          <w:cantSplit/>
           <w:cantSplit/>
         </w:trPr>
         <w:tc>
@@ -705,6 +710,8 @@
         <w:trPr>
           <w:cantSplit/>
           <w:tblHeader/>
+          <w:cantSplit/>
+          <w:tblHeader/>
         </w:trPr>
         <w:tc>
           <w:tcPr>
@@ -763,6 +770,7 @@
       </w:tr>
       <w:tr>
         <w:trPr>
+          <w:cantSplit/>
           <w:cantSplit/>
         </w:trPr>
         <w:tc>
@@ -823,6 +831,7 @@
       <w:tr>
         <w:trPr>
           <w:cantSplit/>
+          <w:cantSplit/>
         </w:trPr>
         <w:tc>
           <w:tcPr>
@@ -881,6 +890,7 @@
       </w:tr>
       <w:tr>
         <w:trPr>
+          <w:cantSplit/>
           <w:cantSplit/>
         </w:trPr>
         <w:tc>
@@ -941,6 +951,7 @@
       <w:tr>
         <w:trPr>
           <w:cantSplit/>
+          <w:cantSplit/>
         </w:trPr>
         <w:tc>
           <w:tcPr>
@@ -999,6 +1010,7 @@
       </w:tr>
       <w:tr>
         <w:trPr>
+          <w:cantSplit/>
           <w:cantSplit/>
         </w:trPr>
         <w:tc>
@@ -1059,6 +1071,7 @@
       <w:tr>
         <w:trPr>
           <w:cantSplit/>
+          <w:cantSplit/>
         </w:trPr>
         <w:tc>
           <w:tcPr>
@@ -1117,6 +1130,7 @@
       </w:tr>
       <w:tr>
         <w:trPr>
+          <w:cantSplit/>
           <w:cantSplit/>
         </w:trPr>
         <w:tc>
@@ -1177,6 +1191,7 @@
       <w:tr>
         <w:trPr>
           <w:cantSplit/>
+          <w:cantSplit/>
         </w:trPr>
         <w:tc>
           <w:tcPr>
@@ -1235,6 +1250,7 @@
       </w:tr>
       <w:tr>
         <w:trPr>
+          <w:cantSplit/>
           <w:cantSplit/>
         </w:trPr>
         <w:tc>
@@ -1295,6 +1311,7 @@
       <w:tr>
         <w:trPr>
           <w:cantSplit/>
+          <w:cantSplit/>
         </w:trPr>
         <w:tc>
           <w:tcPr>
@@ -1354,6 +1371,7 @@
       <w:tr>
         <w:trPr>
           <w:cantSplit/>
+          <w:cantSplit/>
         </w:trPr>
         <w:tc>
           <w:tcPr>
@@ -1412,6 +1430,7 @@
       </w:tr>
       <w:tr>
         <w:trPr>
+          <w:cantSplit/>
           <w:cantSplit/>
         </w:trPr>
         <w:tc>
@@ -1934,7 +1953,87 @@
         <w:t>PET-09:</w:t>
       </w:r>
       <w:r>
-        <w:t xml:space="preserve"> After provider integration, run sandbox order, payment, verified webhook, dispatch, receipt, refund and settlement reconciliation. Reject forged signature, wrong amount/currency/order, replay, duplicate, delayed and reversed webhook order. Do not lose money/stock on timeout or retry. P1 stays BLOCKED until the provider and integration exist; P2 needs separate live evidence.</w:t>
+        <w:t xml:space="preserve"> After provider setup, run sandbox checkout and signed-event reconciliation. Sandbox success must not unlock dispatch or change stock. Reject forged signatures, wrong financial identity, replay and duplicate or reversed events. Live collection, dispatch, receipt, refund and settlement need separate P2 acceptance under the approved policy. Both modes must preserve money and stock on timeout or retry; missing provider setup keeps P1 blocked.</w:t>
+      </w:r>
+    </w:p>
+    <w:p>
+      <w:pPr>
+        <w:pStyle w:val="Heading2"/>
+      </w:pPr>
+      <w:r>
+        <w:t>Additional current source checks</w:t>
+      </w:r>
+    </w:p>
+    <w:p>
+      <w:r>
+        <w:t xml:space="preserve">The </w:t>
+      </w:r>
+      <w:hyperlink r:id="rId11">
+        <w:r>
+          <w:rPr>
+            <w:u w:val="single"/>
+          </w:rPr>
+          <w:t>team test manual</w:t>
+        </w:r>
+      </w:hyperlink>
+      <w:r>
+        <w:t xml:space="preserve"> now contains dedicated </w:t>
+      </w:r>
+      <w:r>
+        <w:rPr>
+          <w:b/>
+        </w:rPr>
+        <w:t>INTAKE</w:t>
+      </w:r>
+      <w:r>
+        <w:t xml:space="preserve">, </w:t>
+      </w:r>
+      <w:r>
+        <w:rPr>
+          <w:b/>
+        </w:rPr>
+        <w:t>CLASSIFY</w:t>
+      </w:r>
+      <w:r>
+        <w:t xml:space="preserve"> and </w:t>
+      </w:r>
+      <w:r>
+        <w:rPr>
+          <w:b/>
+        </w:rPr>
+        <w:t>MULTI</w:t>
+      </w:r>
+      <w:r>
+        <w:t xml:space="preserve"> cases. Run these against the candidate alongside the PET cases above:</w:t>
+      </w:r>
+    </w:p>
+    <w:p>
+      <w:pPr>
+        <w:pStyle w:val="ListBullet"/>
+      </w:pPr>
+      <w:r>
+        <w:t>Manufacturer own-production intake adds exact weighed grams to inventory only after an approved material, production date, batch/weighing references and non-duplication confirmation. Check an identical retry, conflicting reference, invalid/future date and denied role/material without duplicate or partial stock changes.</w:t>
+      </w:r>
+    </w:p>
+    <w:p>
+      <w:pPr>
+        <w:pStyle w:val="ListBullet"/>
+      </w:pPr>
+      <w:r>
+        <w:t>Admin material classification records an explicit hazardous/non-hazardous decision and rationale/evidence reference, with required admin authentication and audit. Sector colours and facility capabilities cannot approve it. A hazardous decision blocks ordinary byproduct offers.</w:t>
+      </w:r>
+    </w:p>
+    <w:p>
+      <w:pPr>
+        <w:pStyle w:val="ListBullet"/>
+      </w:pPr>
+      <w:r>
+        <w:t>Multi-input transformation consumes per-lot whole grams from up to 20 distinct held ordinary-route lots. Check 800 g plus 200 g into four 250 g outputs, source histories, own output genealogy, overdraw/duplicate/cross-workspace denial, and private process history after a hand-off. This evidence does not add inventory.</w:t>
+      </w:r>
+    </w:p>
+    <w:p>
+      <w:r>
+        <w:t>The multi-input slice has 32 focused passing tests and one local connected industry journey. These are bounded source checks. Keep final combined regression, provider execution and production smoke results separate in section 13; do not infer a pass for every case from them.</w:t>
       </w:r>
     </w:p>
     <w:p>
@@ -2132,10 +2231,9 @@
       <w:r>
         <w:t xml:space="preserve">The founder starts these checks now. An existing account is not proof of sender approval, delivery, merchant onboarding or live execution. The exact setup list is in </w:t>
       </w:r>
-      <w:hyperlink r:id="rId11">
+      <w:hyperlink r:id="rId12">
         <w:r>
           <w:rPr>
-            <w:color w:val="175C73"/>
             <w:u w:val="single"/>
           </w:rPr>
           <w:t>Account and deployment checklist</w:t>
@@ -2167,6 +2265,8 @@
       </w:tblGrid>
       <w:tr>
         <w:trPr>
+          <w:cantSplit/>
+          <w:tblHeader/>
           <w:cantSplit/>
           <w:tblHeader/>
         </w:trPr>
@@ -2228,6 +2328,7 @@
       <w:tr>
         <w:trPr>
           <w:cantSplit/>
+          <w:cantSplit/>
         </w:trPr>
         <w:tc>
           <w:tcPr>
@@ -2286,6 +2387,7 @@
       </w:tr>
       <w:tr>
         <w:trPr>
+          <w:cantSplit/>
           <w:cantSplit/>
         </w:trPr>
         <w:tc>
@@ -2346,6 +2448,7 @@
       <w:tr>
         <w:trPr>
           <w:cantSplit/>
+          <w:cantSplit/>
         </w:trPr>
         <w:tc>
           <w:tcPr>
@@ -2397,13 +2500,14 @@
                 <w:color w:val="000000"/>
                 <w:sz w:val="19"/>
               </w:rPr>
-              <w:t>Create or verify owner account, owned sender domain, DNS verification, restricted API key and sender. Required for the approved production email verification/reset/invite path; implementation and delivered-mail proof remain gates.</w:t>
+              <w:t>Create or verify owner account, owned sender domain, DNS verification, restricted API key and sender. The verification/reset/invitation delivery code is implemented; configured sender acceptance, delivered-mail proof and usable production links remain gates.</w:t>
             </w:r>
           </w:p>
         </w:tc>
       </w:tr>
       <w:tr>
         <w:trPr>
+          <w:cantSplit/>
           <w:cantSplit/>
         </w:trPr>
         <w:tc>
@@ -2464,6 +2568,7 @@
       <w:tr>
         <w:trPr>
           <w:cantSplit/>
+          <w:cantSplit/>
         </w:trPr>
         <w:tc>
           <w:tcPr>
@@ -2515,13 +2620,14 @@
                 <w:color w:val="000000"/>
                 <w:sz w:val="19"/>
               </w:rPr>
-              <w:t>Provider not selected. Founder must confirm marketplace/vendor settlement fit and eligibility; engineer must implement webhook reconciliation. Sandbox and live approval are separate. No manual paid substitute.</w:t>
+              <w:t>Cashfree Payment Gateway + Easy Split selected. Checkout, signed-webhook reconciliation, trade/stock integration, refund and settlement controls are implemented. Founder must obtain use-case approval and activation. Actual sandbox and live collection/refund/settlement acceptance remain separate gates. No manual paid substitute.</w:t>
             </w:r>
           </w:p>
         </w:tc>
       </w:tr>
       <w:tr>
         <w:trPr>
+          <w:cantSplit/>
           <w:cantSplit/>
         </w:trPr>
         <w:tc>
@@ -2630,6 +2736,8 @@
         <w:trPr>
           <w:cantSplit/>
           <w:tblHeader/>
+          <w:cantSplit/>
+          <w:tblHeader/>
         </w:trPr>
         <w:tc>
           <w:tcPr>
@@ -2688,6 +2796,7 @@
       </w:tr>
       <w:tr>
         <w:trPr>
+          <w:cantSplit/>
           <w:cantSplit/>
         </w:trPr>
         <w:tc>
@@ -2748,6 +2857,7 @@
       <w:tr>
         <w:trPr>
           <w:cantSplit/>
+          <w:cantSplit/>
         </w:trPr>
         <w:tc>
           <w:tcPr>
@@ -2806,6 +2916,7 @@
       </w:tr>
       <w:tr>
         <w:trPr>
+          <w:cantSplit/>
           <w:cantSplit/>
         </w:trPr>
         <w:tc>
@@ -2866,6 +2977,7 @@
       <w:tr>
         <w:trPr>
           <w:cantSplit/>
+          <w:cantSplit/>
         </w:trPr>
         <w:tc>
           <w:tcPr>
@@ -2924,6 +3036,7 @@
       </w:tr>
       <w:tr>
         <w:trPr>
+          <w:cantSplit/>
           <w:cantSplit/>
         </w:trPr>
         <w:tc>
@@ -2984,6 +3097,7 @@
       <w:tr>
         <w:trPr>
           <w:cantSplit/>
+          <w:cantSplit/>
         </w:trPr>
         <w:tc>
           <w:tcPr>
@@ -3043,6 +3157,7 @@
       <w:tr>
         <w:trPr>
           <w:cantSplit/>
+          <w:cantSplit/>
         </w:trPr>
         <w:tc>
           <w:tcPr>
@@ -3101,6 +3216,7 @@
       </w:tr>
       <w:tr>
         <w:trPr>
+          <w:cantSplit/>
           <w:cantSplit/>
         </w:trPr>
         <w:tc>
@@ -3356,10 +3472,1160 @@
         <w:rPr>
           <w:b/>
         </w:rPr>
-        <w:t>As of 6 October:</w:t>
+        <w:t>Checkpoint: 7 October 2026.</w:t>
       </w:r>
       <w:r>
-        <w:t xml:space="preserve"> this plan is prepared, not executed. Local backend startup is reported; full local auth/role acceptance remains pending. Email sender, SMS approval, B2B gateway, production deployment, guide synchronization and native release gates have no current pass evidence in this plan. Accounts outside the known GitHub/Convex/Vercel projects must be verified by the founder. No credentials have been added to this document.</w:t>
+        <w:t xml:space="preserve"> Integration branch </w:t>
+      </w:r>
+      <w:r>
+        <w:rPr>
+          <w:rFonts w:ascii="Liberation Mono" w:hAnsi="Liberation Mono"/>
+          <w:sz w:val="17"/>
+        </w:rPr>
+        <w:t>codex/platform-refinement</w:t>
+      </w:r>
+      <w:r>
+        <w:t xml:space="preserve">, base commit </w:t>
+      </w:r>
+      <w:r>
+        <w:rPr>
+          <w:rFonts w:ascii="Liberation Mono" w:hAnsi="Liberation Mono"/>
+          <w:sz w:val="17"/>
+        </w:rPr>
+        <w:t>9146ce6</w:t>
+      </w:r>
+      <w:r>
+        <w:t xml:space="preserve"> plus current task changes. These are local L0/L1 results, not production or provider results. The local site is </w:t>
+      </w:r>
+      <w:r>
+        <w:rPr>
+          <w:rFonts w:ascii="Liberation Mono" w:hAnsi="Liberation Mono"/>
+          <w:sz w:val="17"/>
+        </w:rPr>
+        <w:t>http://localhost:3100</w:t>
+      </w:r>
+      <w:r>
+        <w:t xml:space="preserve">; Convex uses </w:t>
+      </w:r>
+      <w:r>
+        <w:rPr>
+          <w:rFonts w:ascii="Liberation Mono" w:hAnsi="Liberation Mono"/>
+          <w:sz w:val="17"/>
+        </w:rPr>
+        <w:t>127.0.0.1:3210/3211</w:t>
+      </w:r>
+      <w:r>
+        <w:t xml:space="preserve">; the protected local delivery inbox uses port 3215. The final combined connected suite passed </w:t>
+      </w:r>
+      <w:r>
+        <w:rPr>
+          <w:b/>
+        </w:rPr>
+        <w:t>55 of 55 browser cases in 4.6 minutes</w:t>
+      </w:r>
+      <w:r>
+        <w:t xml:space="preserve"> against the local production build on 7 October 2026. Evidence: </w:t>
+      </w:r>
+      <w:r>
+        <w:rPr>
+          <w:rFonts w:ascii="Liberation Mono" w:hAnsi="Liberation Mono"/>
+          <w:sz w:val="17"/>
+        </w:rPr>
+        <w:t>/private/tmp/luma-final-connected-scope-copy.log</w:t>
+      </w:r>
+      <w:r>
+        <w:t>. This includes the new sourcing, route/load, governed operations, private quality-file/report-sharing and dialog keyboard journeys, plus the existing account, workspace, material and financial flows. Full lint passed with zero errors and 20 warnings; production build, web/backend types and native tests (49 mobile, 22 desktop) passed.</w:t>
+      </w:r>
+    </w:p>
+    <w:p>
+      <w:r>
+        <w:t>After that combined run, visual review found that stock without a market price showed a zero value. The correction keeps unavailable or partially priced stock values unavailable. All 20 focused stock tests and both connected byproduct cases passed; the browser rerun took 9.6 seconds. The production build passed again. The full visual matrix and final whole-project check are being refreshed for this correction; these targeted results do not replace those gates.</w:t>
+      </w:r>
+    </w:p>
+    <w:p>
+      <w:r>
+        <w:t xml:space="preserve">Final responsive captures and original-image review, maintained Word rebuilds, same-ID Google Docs publication and the final full </w:t>
+      </w:r>
+      <w:r>
+        <w:rPr>
+          <w:rFonts w:ascii="Liberation Mono" w:hAnsi="Liberation Mono"/>
+          <w:sz w:val="17"/>
+        </w:rPr>
+        <w:t>pnpm check</w:t>
+      </w:r>
+      <w:r>
+        <w:t xml:space="preserve"> remain pending. The latest full unit preflight passed 2,306 of 2,322 tests in 79.58 seconds. All 16 failures are capture or Word freshness gates; no functional unit test failed. The full project check is still pending, including the final lint rerun. Protected PR/CI, backend-before-frontend deployment, production smoke tests and actual provider acceptance are separate pending gates. Local results do not establish production or provider execution.</w:t>
+      </w:r>
+    </w:p>
+    <w:p>
+      <w:r>
+        <w:t xml:space="preserve">The financial backend passed 137 focused tests, backend types/scoped lint and independent review. The financial UI passed 50 focused tests. Current captures are being collected and inspected; Word, Google Docs and release checks follow. The earlier 49-case, 4.6-minute run in </w:t>
+      </w:r>
+      <w:r>
+        <w:rPr>
+          <w:rFonts w:ascii="Liberation Mono" w:hAnsi="Liberation Mono"/>
+          <w:sz w:val="17"/>
+        </w:rPr>
+        <w:t>/private/tmp/luma-final-connected-4.log</w:t>
+      </w:r>
+      <w:r>
+        <w:t xml:space="preserve"> is retained as the historical pre-bridge baseline, not the current result.</w:t>
+      </w:r>
+    </w:p>
+    <w:tbl>
+      <w:tblPr>
+        <w:tblStyle w:val="TableGrid"/>
+        <w:tblW w:type="auto" w:w="0"/>
+        <w:jc w:val="center"/>
+        <w:tblLayout w:type="fixed"/>
+        <w:tblLook w:firstColumn="1" w:firstRow="1" w:lastColumn="0" w:lastRow="0" w:noHBand="0" w:noVBand="1" w:val="04A0"/>
+        <w:tblBorders>
+          <w:top w:val="single" w:sz="4" w:color="D9D9D9"/>
+          <w:left w:val="single" w:sz="4" w:color="D9D9D9"/>
+          <w:bottom w:val="single" w:sz="4" w:color="D9D9D9"/>
+          <w:right w:val="single" w:sz="4" w:color="D9D9D9"/>
+          <w:insideH w:val="single" w:sz="4" w:color="D9D9D9"/>
+          <w:insideV w:val="single" w:sz="4" w:color="D9D9D9"/>
+        </w:tblBorders>
+      </w:tblPr>
+      <w:tblGrid>
+        <w:gridCol w:w="2563"/>
+        <w:gridCol w:w="7603"/>
+      </w:tblGrid>
+      <w:tr>
+        <w:trPr>
+          <w:cantSplit/>
+          <w:tblHeader/>
+          <w:cantSplit/>
+          <w:tblHeader/>
+        </w:trPr>
+        <w:tc>
+          <w:tcPr>
+            <w:tcW w:type="dxa" w:w="2563"/>
+            <w:vAlign w:val="center"/>
+            <w:shd w:fill="DCE6EE"/>
+            <w:tcMar>
+              <w:top w:w="85" w:type="dxa"/>
+              <w:left w:w="85" w:type="dxa"/>
+              <w:bottom w:w="85" w:type="dxa"/>
+              <w:right w:w="85" w:type="dxa"/>
+            </w:tcMar>
+          </w:tcPr>
+          <w:p>
+            <w:pPr>
+              <w:spacing w:after="40" w:before="40" w:line="245" w:lineRule="auto"/>
+            </w:pPr>
+            <w:r>
+              <w:rPr>
+                <w:rFonts w:ascii="Arial" w:hAnsi="Arial"/>
+                <w:b/>
+                <w:color w:val="000000"/>
+                <w:sz w:val="19"/>
+              </w:rPr>
+              <w:t>Check</w:t>
+            </w:r>
+          </w:p>
+        </w:tc>
+        <w:tc>
+          <w:tcPr>
+            <w:tcW w:type="dxa" w:w="7603"/>
+            <w:vAlign w:val="center"/>
+            <w:shd w:fill="DCE6EE"/>
+            <w:tcMar>
+              <w:top w:w="85" w:type="dxa"/>
+              <w:left w:w="85" w:type="dxa"/>
+              <w:bottom w:w="85" w:type="dxa"/>
+              <w:right w:w="85" w:type="dxa"/>
+            </w:tcMar>
+          </w:tcPr>
+          <w:p>
+            <w:pPr>
+              <w:spacing w:after="40" w:before="40" w:line="245" w:lineRule="auto"/>
+            </w:pPr>
+            <w:r>
+              <w:rPr>
+                <w:rFonts w:ascii="Arial" w:hAnsi="Arial"/>
+                <w:b/>
+                <w:color w:val="000000"/>
+                <w:sz w:val="19"/>
+              </w:rPr>
+              <w:t>Result and limits</w:t>
+            </w:r>
+          </w:p>
+        </w:tc>
+      </w:tr>
+      <w:tr>
+        <w:trPr>
+          <w:cantSplit/>
+          <w:cantSplit/>
+        </w:trPr>
+        <w:tc>
+          <w:tcPr>
+            <w:tcW w:type="dxa" w:w="2563"/>
+            <w:vAlign w:val="center"/>
+            <w:shd w:fill="FFFFFF"/>
+            <w:tcMar>
+              <w:top w:w="85" w:type="dxa"/>
+              <w:left w:w="85" w:type="dxa"/>
+              <w:bottom w:w="85" w:type="dxa"/>
+              <w:right w:w="85" w:type="dxa"/>
+            </w:tcMar>
+          </w:tcPr>
+          <w:p>
+            <w:pPr>
+              <w:spacing w:after="40" w:before="40" w:line="245" w:lineRule="auto"/>
+            </w:pPr>
+            <w:r>
+              <w:rPr>
+                <w:rFonts w:ascii="Arial" w:hAnsi="Arial"/>
+                <w:b w:val="0"/>
+                <w:color w:val="000000"/>
+                <w:sz w:val="19"/>
+              </w:rPr>
+              <w:t>Disposable accounts</w:t>
+            </w:r>
+          </w:p>
+        </w:tc>
+        <w:tc>
+          <w:tcPr>
+            <w:tcW w:type="dxa" w:w="7603"/>
+            <w:vAlign w:val="center"/>
+            <w:shd w:fill="FFFFFF"/>
+            <w:tcMar>
+              <w:top w:w="85" w:type="dxa"/>
+              <w:left w:w="85" w:type="dxa"/>
+              <w:bottom w:w="85" w:type="dxa"/>
+              <w:right w:w="85" w:type="dxa"/>
+            </w:tcMar>
+          </w:tcPr>
+          <w:p>
+            <w:pPr>
+              <w:spacing w:after="40" w:before="40" w:line="245" w:lineRule="auto"/>
+            </w:pPr>
+            <w:r>
+              <w:rPr>
+                <w:rFonts w:ascii="Arial" w:hAnsi="Arial"/>
+                <w:b w:val="0"/>
+                <w:color w:val="000000"/>
+                <w:sz w:val="19"/>
+              </w:rPr>
+              <w:t>28 email identities use real local signup, verification and password sign-in. The guarded fixture adds synthetic domain records. Passwords remain in the restricted local annex.</w:t>
+            </w:r>
+          </w:p>
+        </w:tc>
+      </w:tr>
+      <w:tr>
+        <w:trPr>
+          <w:cantSplit/>
+          <w:cantSplit/>
+        </w:trPr>
+        <w:tc>
+          <w:tcPr>
+            <w:tcW w:type="dxa" w:w="2563"/>
+            <w:vAlign w:val="center"/>
+            <w:shd w:fill="FFFFFF"/>
+            <w:tcMar>
+              <w:top w:w="85" w:type="dxa"/>
+              <w:left w:w="85" w:type="dxa"/>
+              <w:bottom w:w="85" w:type="dxa"/>
+              <w:right w:w="85" w:type="dxa"/>
+            </w:tcMar>
+          </w:tcPr>
+          <w:p>
+            <w:pPr>
+              <w:spacing w:after="40" w:before="40" w:line="245" w:lineRule="auto"/>
+            </w:pPr>
+            <w:r>
+              <w:rPr>
+                <w:rFonts w:ascii="Arial" w:hAnsi="Arial"/>
+                <w:b w:val="0"/>
+                <w:color w:val="000000"/>
+                <w:sz w:val="19"/>
+              </w:rPr>
+              <w:t>Account access</w:t>
+            </w:r>
+          </w:p>
+        </w:tc>
+        <w:tc>
+          <w:tcPr>
+            <w:tcW w:type="dxa" w:w="7603"/>
+            <w:vAlign w:val="center"/>
+            <w:shd w:fill="FFFFFF"/>
+            <w:tcMar>
+              <w:top w:w="85" w:type="dxa"/>
+              <w:left w:w="85" w:type="dxa"/>
+              <w:bottom w:w="85" w:type="dxa"/>
+              <w:right w:w="85" w:type="dxa"/>
+            </w:tcMar>
+          </w:tcPr>
+          <w:p>
+            <w:pPr>
+              <w:spacing w:after="40" w:before="40" w:line="245" w:lineRule="auto"/>
+            </w:pPr>
+            <w:r>
+              <w:rPr>
+                <w:rFonts w:ascii="Arial" w:hAnsi="Arial"/>
+                <w:b w:val="0"/>
+                <w:color w:val="000000"/>
+                <w:sz w:val="19"/>
+              </w:rPr>
+              <w:t>PASS: all 28 role accounts complete their permitted navigation journey. The earlier household-coordinator, CSR-sponsor and team-viewer failures are resolved in the combined run. Screen access does not prove every business workflow.</w:t>
+            </w:r>
+          </w:p>
+        </w:tc>
+      </w:tr>
+      <w:tr>
+        <w:trPr>
+          <w:cantSplit/>
+          <w:cantSplit/>
+        </w:trPr>
+        <w:tc>
+          <w:tcPr>
+            <w:tcW w:type="dxa" w:w="2563"/>
+            <w:vAlign w:val="center"/>
+            <w:shd w:fill="FFFFFF"/>
+            <w:tcMar>
+              <w:top w:w="85" w:type="dxa"/>
+              <w:left w:w="85" w:type="dxa"/>
+              <w:bottom w:w="85" w:type="dxa"/>
+              <w:right w:w="85" w:type="dxa"/>
+            </w:tcMar>
+          </w:tcPr>
+          <w:p>
+            <w:pPr>
+              <w:spacing w:after="40" w:before="40" w:line="245" w:lineRule="auto"/>
+            </w:pPr>
+            <w:r>
+              <w:rPr>
+                <w:rFonts w:ascii="Arial" w:hAnsi="Arial"/>
+                <w:b w:val="0"/>
+                <w:color w:val="000000"/>
+                <w:sz w:val="19"/>
+              </w:rPr>
+              <w:t>Workspace invitation</w:t>
+            </w:r>
+          </w:p>
+        </w:tc>
+        <w:tc>
+          <w:tcPr>
+            <w:tcW w:type="dxa" w:w="7603"/>
+            <w:vAlign w:val="center"/>
+            <w:shd w:fill="FFFFFF"/>
+            <w:tcMar>
+              <w:top w:w="85" w:type="dxa"/>
+              <w:left w:w="85" w:type="dxa"/>
+              <w:bottom w:w="85" w:type="dxa"/>
+              <w:right w:w="85" w:type="dxa"/>
+            </w:tcMar>
+          </w:tcPr>
+          <w:p>
+            <w:pPr>
+              <w:spacing w:after="40" w:before="40" w:line="245" w:lineRule="auto"/>
+            </w:pPr>
+            <w:r>
+              <w:rPr>
+                <w:rFonts w:ascii="Arial" w:hAnsi="Arial"/>
+                <w:b w:val="0"/>
+                <w:color w:val="000000"/>
+                <w:sz w:val="19"/>
+              </w:rPr>
+              <w:t>PASS: invitation, matching-email checks, workspace isolation, switching, role removal and recovery. Transport failure shows an explicit manual retry. The invitation quota was allowed to expire naturally; no quota bypass was used.</w:t>
+            </w:r>
+          </w:p>
+        </w:tc>
+      </w:tr>
+      <w:tr>
+        <w:trPr>
+          <w:cantSplit/>
+          <w:cantSplit/>
+        </w:trPr>
+        <w:tc>
+          <w:tcPr>
+            <w:tcW w:type="dxa" w:w="2563"/>
+            <w:vAlign w:val="center"/>
+            <w:shd w:fill="FFFFFF"/>
+            <w:tcMar>
+              <w:top w:w="85" w:type="dxa"/>
+              <w:left w:w="85" w:type="dxa"/>
+              <w:bottom w:w="85" w:type="dxa"/>
+              <w:right w:w="85" w:type="dxa"/>
+            </w:tcMar>
+          </w:tcPr>
+          <w:p>
+            <w:pPr>
+              <w:spacing w:after="40" w:before="40" w:line="245" w:lineRule="auto"/>
+            </w:pPr>
+            <w:r>
+              <w:rPr>
+                <w:rFonts w:ascii="Arial" w:hAnsi="Arial"/>
+                <w:b w:val="0"/>
+                <w:color w:val="000000"/>
+                <w:sz w:val="19"/>
+              </w:rPr>
+              <w:t>Email lifecycle and phone binding</w:t>
+            </w:r>
+          </w:p>
+        </w:tc>
+        <w:tc>
+          <w:tcPr>
+            <w:tcW w:type="dxa" w:w="7603"/>
+            <w:vAlign w:val="center"/>
+            <w:shd w:fill="FFFFFF"/>
+            <w:tcMar>
+              <w:top w:w="85" w:type="dxa"/>
+              <w:left w:w="85" w:type="dxa"/>
+              <w:bottom w:w="85" w:type="dxa"/>
+              <w:right w:w="85" w:type="dxa"/>
+            </w:tcMar>
+          </w:tcPr>
+          <w:p>
+            <w:pPr>
+              <w:spacing w:after="40" w:before="40" w:line="245" w:lineRule="auto"/>
+            </w:pPr>
+            <w:r>
+              <w:rPr>
+                <w:rFonts w:ascii="Arial" w:hAnsi="Arial"/>
+                <w:b w:val="0"/>
+                <w:color w:val="000000"/>
+                <w:sz w:val="19"/>
+              </w:rPr>
+              <w:t>PASS: signup, verification, password login and reset, earlier-session revocation, replay and old-password denial, logout, and explicit binding of an unused phone to a verified email account. No real email or SMS delivery is proved.</w:t>
+            </w:r>
+          </w:p>
+        </w:tc>
+      </w:tr>
+      <w:tr>
+        <w:trPr>
+          <w:cantSplit/>
+          <w:cantSplit/>
+        </w:trPr>
+        <w:tc>
+          <w:tcPr>
+            <w:tcW w:type="dxa" w:w="2563"/>
+            <w:vAlign w:val="center"/>
+            <w:shd w:fill="FFFFFF"/>
+            <w:tcMar>
+              <w:top w:w="85" w:type="dxa"/>
+              <w:left w:w="85" w:type="dxa"/>
+              <w:bottom w:w="85" w:type="dxa"/>
+              <w:right w:w="85" w:type="dxa"/>
+            </w:tcMar>
+          </w:tcPr>
+          <w:p>
+            <w:pPr>
+              <w:spacing w:after="40" w:before="40" w:line="245" w:lineRule="auto"/>
+            </w:pPr>
+            <w:r>
+              <w:rPr>
+                <w:rFonts w:ascii="Arial" w:hAnsi="Arial"/>
+                <w:b w:val="0"/>
+                <w:color w:val="000000"/>
+                <w:sz w:val="19"/>
+              </w:rPr>
+              <w:t>Household receipt</w:t>
+            </w:r>
+          </w:p>
+        </w:tc>
+        <w:tc>
+          <w:tcPr>
+            <w:tcW w:type="dxa" w:w="7603"/>
+            <w:vAlign w:val="center"/>
+            <w:shd w:fill="FFFFFF"/>
+            <w:tcMar>
+              <w:top w:w="85" w:type="dxa"/>
+              <w:left w:w="85" w:type="dxa"/>
+              <w:bottom w:w="85" w:type="dxa"/>
+              <w:right w:w="85" w:type="dxa"/>
+            </w:tcMar>
+          </w:tcPr>
+          <w:p>
+            <w:pPr>
+              <w:spacing w:after="40" w:before="40" w:line="245" w:lineRule="auto"/>
+            </w:pPr>
+            <w:r>
+              <w:rPr>
+                <w:rFonts w:ascii="Arial" w:hAnsi="Arial"/>
+                <w:b w:val="0"/>
+                <w:color w:val="000000"/>
+                <w:sz w:val="19"/>
+              </w:rPr>
+              <w:t>PASS: actual local phone verification, pickup, kabadiwala weighing and direct household payment record. 1,250 g at 1,400 paise/kg gives 1,750 paise; duplicate completion is denied without duplicate stock.</w:t>
+            </w:r>
+          </w:p>
+        </w:tc>
+      </w:tr>
+      <w:tr>
+        <w:trPr>
+          <w:cantSplit/>
+          <w:cantSplit/>
+        </w:trPr>
+        <w:tc>
+          <w:tcPr>
+            <w:tcW w:type="dxa" w:w="2563"/>
+            <w:vAlign w:val="center"/>
+            <w:shd w:fill="FFFFFF"/>
+            <w:tcMar>
+              <w:top w:w="85" w:type="dxa"/>
+              <w:left w:w="85" w:type="dxa"/>
+              <w:bottom w:w="85" w:type="dxa"/>
+              <w:right w:w="85" w:type="dxa"/>
+            </w:tcMar>
+          </w:tcPr>
+          <w:p>
+            <w:pPr>
+              <w:spacing w:after="40" w:before="40" w:line="245" w:lineRule="auto"/>
+            </w:pPr>
+            <w:r>
+              <w:rPr>
+                <w:rFonts w:ascii="Arial" w:hAnsi="Arial"/>
+                <w:b w:val="0"/>
+                <w:color w:val="000000"/>
+                <w:sz w:val="19"/>
+              </w:rPr>
+              <w:t>Admin and account TOTP</w:t>
+            </w:r>
+          </w:p>
+        </w:tc>
+        <w:tc>
+          <w:tcPr>
+            <w:tcW w:type="dxa" w:w="7603"/>
+            <w:vAlign w:val="center"/>
+            <w:shd w:fill="FFFFFF"/>
+            <w:tcMar>
+              <w:top w:w="85" w:type="dxa"/>
+              <w:left w:w="85" w:type="dxa"/>
+              <w:bottom w:w="85" w:type="dxa"/>
+              <w:right w:w="85" w:type="dxa"/>
+            </w:tcMar>
+          </w:tcPr>
+          <w:p>
+            <w:pPr>
+              <w:spacing w:after="40" w:before="40" w:line="245" w:lineRule="auto"/>
+            </w:pPr>
+            <w:r>
+              <w:rPr>
+                <w:rFonts w:ascii="Arial" w:hAnsi="Arial"/>
+                <w:b w:val="0"/>
+                <w:color w:val="000000"/>
+                <w:sz w:val="19"/>
+              </w:rPr>
+              <w:t>PASS: fresh local admin setup, mandatory second factor, session rotation, logout and revoked-session denial; user TOTP enrollment and recovery controls are covered. Secrets stay outside screenshots and shared documents.</w:t>
+            </w:r>
+          </w:p>
+        </w:tc>
+      </w:tr>
+      <w:tr>
+        <w:trPr>
+          <w:cantSplit/>
+          <w:cantSplit/>
+        </w:trPr>
+        <w:tc>
+          <w:tcPr>
+            <w:tcW w:type="dxa" w:w="2563"/>
+            <w:vAlign w:val="center"/>
+            <w:shd w:fill="FFFFFF"/>
+            <w:tcMar>
+              <w:top w:w="85" w:type="dxa"/>
+              <w:left w:w="85" w:type="dxa"/>
+              <w:bottom w:w="85" w:type="dxa"/>
+              <w:right w:w="85" w:type="dxa"/>
+            </w:tcMar>
+          </w:tcPr>
+          <w:p>
+            <w:pPr>
+              <w:spacing w:after="40" w:before="40" w:line="245" w:lineRule="auto"/>
+            </w:pPr>
+            <w:r>
+              <w:rPr>
+                <w:rFonts w:ascii="Arial" w:hAnsi="Arial"/>
+                <w:b w:val="0"/>
+                <w:color w:val="000000"/>
+                <w:sz w:val="19"/>
+              </w:rPr>
+              <w:t>Lots and quality</w:t>
+            </w:r>
+          </w:p>
+        </w:tc>
+        <w:tc>
+          <w:tcPr>
+            <w:tcW w:type="dxa" w:w="7603"/>
+            <w:vAlign w:val="center"/>
+            <w:shd w:fill="FFFFFF"/>
+            <w:tcMar>
+              <w:top w:w="85" w:type="dxa"/>
+              <w:left w:w="85" w:type="dxa"/>
+              <w:bottom w:w="85" w:type="dxa"/>
+              <w:right w:w="85" w:type="dxa"/>
+            </w:tcMar>
+          </w:tcPr>
+          <w:p>
+            <w:pPr>
+              <w:spacing w:after="40" w:before="40" w:line="245" w:lineRule="auto"/>
+            </w:pPr>
+            <w:r>
+              <w:rPr>
+                <w:rFonts w:ascii="Arial" w:hAnsi="Arial"/>
+                <w:b w:val="0"/>
+                <w:color w:val="000000"/>
+                <w:sz w:val="19"/>
+              </w:rPr>
+              <w:t>PASS: exact mass, balanced transformation, inspection correction and separate approval, viewer denial, dispatch, receiver privacy, weight checks and custody transfer. These evidence records do not change commercial inventory or payment.</w:t>
+            </w:r>
+          </w:p>
+        </w:tc>
+      </w:tr>
+      <w:tr>
+        <w:trPr>
+          <w:cantSplit/>
+          <w:cantSplit/>
+        </w:trPr>
+        <w:tc>
+          <w:tcPr>
+            <w:tcW w:type="dxa" w:w="2563"/>
+            <w:vAlign w:val="center"/>
+            <w:shd w:fill="FFFFFF"/>
+            <w:tcMar>
+              <w:top w:w="85" w:type="dxa"/>
+              <w:left w:w="85" w:type="dxa"/>
+              <w:bottom w:w="85" w:type="dxa"/>
+              <w:right w:w="85" w:type="dxa"/>
+            </w:tcMar>
+          </w:tcPr>
+          <w:p>
+            <w:pPr>
+              <w:spacing w:after="40" w:before="40" w:line="245" w:lineRule="auto"/>
+            </w:pPr>
+            <w:r>
+              <w:rPr>
+                <w:rFonts w:ascii="Arial" w:hAnsi="Arial"/>
+                <w:b w:val="0"/>
+                <w:color w:val="000000"/>
+                <w:sz w:val="19"/>
+              </w:rPr>
+              <w:t>Industry and facility records</w:t>
+            </w:r>
+          </w:p>
+        </w:tc>
+        <w:tc>
+          <w:tcPr>
+            <w:tcW w:type="dxa" w:w="7603"/>
+            <w:vAlign w:val="center"/>
+            <w:shd w:fill="FFFFFF"/>
+            <w:tcMar>
+              <w:top w:w="85" w:type="dxa"/>
+              <w:left w:w="85" w:type="dxa"/>
+              <w:bottom w:w="85" w:type="dxa"/>
+              <w:right w:w="85" w:type="dxa"/>
+            </w:tcMar>
+          </w:tcPr>
+          <w:p>
+            <w:pPr>
+              <w:spacing w:after="40" w:before="40" w:line="245" w:lineRule="auto"/>
+            </w:pPr>
+            <w:r>
+              <w:rPr>
+                <w:rFonts w:ascii="Arial" w:hAnsi="Arial"/>
+                <w:b w:val="0"/>
+                <w:color w:val="000000"/>
+                <w:sz w:val="19"/>
+              </w:rPr>
+              <w:t>PASS: workbook reference selection, facility processes, reported registration references and corrections, classified outputs, controlled disposition and multiple input lots. The test combines 800 g and 200 g into four 250 g outputs. Reference data and date status do not prove regulatory approval.</w:t>
+            </w:r>
+          </w:p>
+        </w:tc>
+      </w:tr>
+      <w:tr>
+        <w:trPr>
+          <w:cantSplit/>
+          <w:cantSplit/>
+        </w:trPr>
+        <w:tc>
+          <w:tcPr>
+            <w:tcW w:type="dxa" w:w="2563"/>
+            <w:vAlign w:val="center"/>
+            <w:shd w:fill="FFFFFF"/>
+            <w:tcMar>
+              <w:top w:w="85" w:type="dxa"/>
+              <w:left w:w="85" w:type="dxa"/>
+              <w:bottom w:w="85" w:type="dxa"/>
+              <w:right w:w="85" w:type="dxa"/>
+            </w:tcMar>
+          </w:tcPr>
+          <w:p>
+            <w:pPr>
+              <w:spacing w:after="40" w:before="40" w:line="245" w:lineRule="auto"/>
+            </w:pPr>
+            <w:r>
+              <w:rPr>
+                <w:rFonts w:ascii="Arial" w:hAnsi="Arial"/>
+                <w:b w:val="0"/>
+                <w:color w:val="000000"/>
+                <w:sz w:val="19"/>
+              </w:rPr>
+              <w:t>Manufacturer stock and offers</w:t>
+            </w:r>
+          </w:p>
+        </w:tc>
+        <w:tc>
+          <w:tcPr>
+            <w:tcW w:type="dxa" w:w="7603"/>
+            <w:vAlign w:val="center"/>
+            <w:shd w:fill="FFFFFF"/>
+            <w:tcMar>
+              <w:top w:w="85" w:type="dxa"/>
+              <w:left w:w="85" w:type="dxa"/>
+              <w:bottom w:w="85" w:type="dxa"/>
+              <w:right w:w="85" w:type="dxa"/>
+            </w:tcMar>
+          </w:tcPr>
+          <w:p>
+            <w:pPr>
+              <w:spacing w:after="40" w:before="40" w:line="245" w:lineRule="auto"/>
+            </w:pPr>
+            <w:r>
+              <w:rPr>
+                <w:rFonts w:ascii="Arial" w:hAnsi="Arial"/>
+                <w:b w:val="0"/>
+                <w:color w:val="000000"/>
+                <w:sz w:val="19"/>
+              </w:rPr>
+              <w:t>PASS: audited own-production intake, idempotent retry, immutable receipt, material classification, eligible byproduct offer, buyer request and seller acceptance. Evidence-only lot records do not create stock. Payment remains gated.</w:t>
+            </w:r>
+          </w:p>
+        </w:tc>
+      </w:tr>
+      <w:tr>
+        <w:trPr>
+          <w:cantSplit/>
+          <w:cantSplit/>
+        </w:trPr>
+        <w:tc>
+          <w:tcPr>
+            <w:tcW w:type="dxa" w:w="2563"/>
+            <w:vAlign w:val="center"/>
+            <w:shd w:fill="FFFFFF"/>
+            <w:tcMar>
+              <w:top w:w="85" w:type="dxa"/>
+              <w:left w:w="85" w:type="dxa"/>
+              <w:bottom w:w="85" w:type="dxa"/>
+              <w:right w:w="85" w:type="dxa"/>
+            </w:tcMar>
+          </w:tcPr>
+          <w:p>
+            <w:pPr>
+              <w:spacing w:after="40" w:before="40" w:line="245" w:lineRule="auto"/>
+            </w:pPr>
+            <w:r>
+              <w:rPr>
+                <w:rFonts w:ascii="Arial" w:hAnsi="Arial"/>
+                <w:b w:val="0"/>
+                <w:color w:val="000000"/>
+                <w:sz w:val="19"/>
+              </w:rPr>
+              <w:t>Commercial document references</w:t>
+            </w:r>
+          </w:p>
+        </w:tc>
+        <w:tc>
+          <w:tcPr>
+            <w:tcW w:type="dxa" w:w="7603"/>
+            <w:vAlign w:val="center"/>
+            <w:shd w:fill="FFFFFF"/>
+            <w:tcMar>
+              <w:top w:w="85" w:type="dxa"/>
+              <w:left w:w="85" w:type="dxa"/>
+              <w:bottom w:w="85" w:type="dxa"/>
+              <w:right w:w="85" w:type="dxa"/>
+            </w:tcMar>
+          </w:tcPr>
+          <w:p>
+            <w:pPr>
+              <w:spacing w:after="40" w:before="40" w:line="245" w:lineRule="auto"/>
+            </w:pPr>
+            <w:r>
+              <w:rPr>
+                <w:rFonts w:ascii="Arial" w:hAnsi="Arial"/>
+                <w:b w:val="0"/>
+                <w:color w:val="000000"/>
+                <w:sz w:val="19"/>
+              </w:rPr>
+              <w:t>PASS: own-workspace access, reported and unverified references, append-only replacements and permission denial. No document issuance or portal verification is claimed.</w:t>
+            </w:r>
+          </w:p>
+        </w:tc>
+      </w:tr>
+      <w:tr>
+        <w:trPr>
+          <w:cantSplit/>
+          <w:cantSplit/>
+        </w:trPr>
+        <w:tc>
+          <w:tcPr>
+            <w:tcW w:type="dxa" w:w="2563"/>
+            <w:vAlign w:val="center"/>
+            <w:shd w:fill="FFFFFF"/>
+            <w:tcMar>
+              <w:top w:w="85" w:type="dxa"/>
+              <w:left w:w="85" w:type="dxa"/>
+              <w:bottom w:w="85" w:type="dxa"/>
+              <w:right w:w="85" w:type="dxa"/>
+            </w:tcMar>
+          </w:tcPr>
+          <w:p>
+            <w:pPr>
+              <w:spacing w:after="40" w:before="40" w:line="245" w:lineRule="auto"/>
+            </w:pPr>
+            <w:r>
+              <w:rPr>
+                <w:rFonts w:ascii="Arial" w:hAnsi="Arial"/>
+                <w:b w:val="0"/>
+                <w:color w:val="000000"/>
+                <w:sz w:val="19"/>
+              </w:rPr>
+              <w:t>Payment boundary</w:t>
+            </w:r>
+          </w:p>
+        </w:tc>
+        <w:tc>
+          <w:tcPr>
+            <w:tcW w:type="dxa" w:w="7603"/>
+            <w:vAlign w:val="center"/>
+            <w:shd w:fill="FFFFFF"/>
+            <w:tcMar>
+              <w:top w:w="85" w:type="dxa"/>
+              <w:left w:w="85" w:type="dxa"/>
+              <w:bottom w:w="85" w:type="dxa"/>
+              <w:right w:w="85" w:type="dxa"/>
+            </w:tcMar>
+          </w:tcPr>
+          <w:p>
+            <w:pPr>
+              <w:spacing w:after="40" w:before="40" w:line="245" w:lineRule="auto"/>
+            </w:pPr>
+            <w:r>
+              <w:rPr>
+                <w:rFonts w:ascii="Arial" w:hAnsi="Arial"/>
+                <w:b w:val="0"/>
+                <w:color w:val="000000"/>
+                <w:sz w:val="19"/>
+              </w:rPr>
+              <w:t>Local backend and browser checks pass for guarded configuration and the unavailable sandbox state. No actual Cashfree checkout, collection, refund or seller settlement was executed. Accepted trade and inventory cannot advance from browser payment claims.</w:t>
+            </w:r>
+          </w:p>
+        </w:tc>
+      </w:tr>
+      <w:tr>
+        <w:trPr>
+          <w:cantSplit/>
+          <w:cantSplit/>
+        </w:trPr>
+        <w:tc>
+          <w:tcPr>
+            <w:tcW w:type="dxa" w:w="2563"/>
+            <w:vAlign w:val="center"/>
+            <w:shd w:fill="FFFFFF"/>
+            <w:tcMar>
+              <w:top w:w="85" w:type="dxa"/>
+              <w:left w:w="85" w:type="dxa"/>
+              <w:bottom w:w="85" w:type="dxa"/>
+              <w:right w:w="85" w:type="dxa"/>
+            </w:tcMar>
+          </w:tcPr>
+          <w:p>
+            <w:pPr>
+              <w:spacing w:after="40" w:before="40" w:line="245" w:lineRule="auto"/>
+            </w:pPr>
+            <w:r>
+              <w:rPr>
+                <w:rFonts w:ascii="Arial" w:hAnsi="Arial"/>
+                <w:b w:val="0"/>
+                <w:color w:val="000000"/>
+                <w:sz w:val="19"/>
+              </w:rPr>
+              <w:t>Project checks</w:t>
+            </w:r>
+          </w:p>
+        </w:tc>
+        <w:tc>
+          <w:tcPr>
+            <w:tcW w:type="dxa" w:w="7603"/>
+            <w:vAlign w:val="center"/>
+            <w:shd w:fill="FFFFFF"/>
+            <w:tcMar>
+              <w:top w:w="85" w:type="dxa"/>
+              <w:left w:w="85" w:type="dxa"/>
+              <w:bottom w:w="85" w:type="dxa"/>
+              <w:right w:w="85" w:type="dxa"/>
+            </w:tcMar>
+          </w:tcPr>
+          <w:p>
+            <w:pPr>
+              <w:spacing w:after="40" w:before="40" w:line="245" w:lineRule="auto"/>
+            </w:pPr>
+            <w:r>
+              <w:rPr>
+                <w:rFonts w:ascii="Arial" w:hAnsi="Arial"/>
+                <w:b w:val="0"/>
+                <w:color w:val="000000"/>
+                <w:sz w:val="19"/>
+              </w:rPr>
+              <w:t>Web/backend types, production build and full lint pass (zero errors, 20 warnings). Native tests pass: 49 mobile and 22 desktop. Latest unit preflight: 2,306 passes and 16 capture/Word freshness failures; no functional unit failures. Final lint rerun pending. Final full check is not yet green.</w:t>
+            </w:r>
+          </w:p>
+        </w:tc>
+      </w:tr>
+      <w:tr>
+        <w:trPr>
+          <w:cantSplit/>
+          <w:cantSplit/>
+        </w:trPr>
+        <w:tc>
+          <w:tcPr>
+            <w:tcW w:type="dxa" w:w="2563"/>
+            <w:vAlign w:val="center"/>
+            <w:shd w:fill="FFFFFF"/>
+            <w:tcMar>
+              <w:top w:w="85" w:type="dxa"/>
+              <w:left w:w="85" w:type="dxa"/>
+              <w:bottom w:w="85" w:type="dxa"/>
+              <w:right w:w="85" w:type="dxa"/>
+            </w:tcMar>
+          </w:tcPr>
+          <w:p>
+            <w:pPr>
+              <w:spacing w:after="40" w:before="40" w:line="245" w:lineRule="auto"/>
+            </w:pPr>
+            <w:r>
+              <w:rPr>
+                <w:rFonts w:ascii="Arial" w:hAnsi="Arial"/>
+                <w:b w:val="0"/>
+                <w:color w:val="000000"/>
+                <w:sz w:val="19"/>
+              </w:rPr>
+              <w:t>Translation checks</w:t>
+            </w:r>
+          </w:p>
+        </w:tc>
+        <w:tc>
+          <w:tcPr>
+            <w:tcW w:type="dxa" w:w="7603"/>
+            <w:vAlign w:val="center"/>
+            <w:shd w:fill="FFFFFF"/>
+            <w:tcMar>
+              <w:top w:w="85" w:type="dxa"/>
+              <w:left w:w="85" w:type="dxa"/>
+              <w:bottom w:w="85" w:type="dxa"/>
+              <w:right w:w="85" w:type="dxa"/>
+            </w:tcMar>
+          </w:tcPr>
+          <w:p>
+            <w:pPr>
+              <w:spacing w:after="40" w:before="40" w:line="245" w:lineRule="auto"/>
+            </w:pPr>
+            <w:r>
+              <w:rPr>
+                <w:rFonts w:ascii="Arial" w:hAnsi="Arial"/>
+                <w:b w:val="0"/>
+                <w:color w:val="000000"/>
+                <w:sz w:val="19"/>
+              </w:rPr>
+              <w:t>PASS: 33 locale catalogues, 2,940 keys each, zero catalogue audit issues. This does not replace native-language review.</w:t>
+            </w:r>
+          </w:p>
+        </w:tc>
+      </w:tr>
+      <w:tr>
+        <w:trPr>
+          <w:cantSplit/>
+          <w:cantSplit/>
+        </w:trPr>
+        <w:tc>
+          <w:tcPr>
+            <w:tcW w:type="dxa" w:w="2563"/>
+            <w:vAlign w:val="center"/>
+            <w:shd w:fill="FFFFFF"/>
+            <w:tcMar>
+              <w:top w:w="85" w:type="dxa"/>
+              <w:left w:w="85" w:type="dxa"/>
+              <w:bottom w:w="85" w:type="dxa"/>
+              <w:right w:w="85" w:type="dxa"/>
+            </w:tcMar>
+          </w:tcPr>
+          <w:p>
+            <w:pPr>
+              <w:spacing w:after="40" w:before="40" w:line="245" w:lineRule="auto"/>
+            </w:pPr>
+            <w:r>
+              <w:rPr>
+                <w:rFonts w:ascii="Arial" w:hAnsi="Arial"/>
+                <w:b w:val="0"/>
+                <w:color w:val="000000"/>
+                <w:sz w:val="19"/>
+              </w:rPr>
+              <w:t>Combined connected browser run</w:t>
+            </w:r>
+          </w:p>
+        </w:tc>
+        <w:tc>
+          <w:tcPr>
+            <w:tcW w:type="dxa" w:w="7603"/>
+            <w:vAlign w:val="center"/>
+            <w:shd w:fill="FFFFFF"/>
+            <w:tcMar>
+              <w:top w:w="85" w:type="dxa"/>
+              <w:left w:w="85" w:type="dxa"/>
+              <w:bottom w:w="85" w:type="dxa"/>
+              <w:right w:w="85" w:type="dxa"/>
+            </w:tcMar>
+          </w:tcPr>
+          <w:p>
+            <w:pPr>
+              <w:spacing w:after="40" w:before="40" w:line="245" w:lineRule="auto"/>
+            </w:pPr>
+            <w:r>
+              <w:rPr>
+                <w:rFonts w:ascii="Arial" w:hAnsi="Arial"/>
+                <w:b w:val="0"/>
+                <w:color w:val="000000"/>
+                <w:sz w:val="19"/>
+              </w:rPr>
+              <w:t>PASS: 55 of 55 cases in 4.6 minutes against the local production build, including sourcing, logistics, private quality files/report sharing, governed operations, intake, classification, multiple-input, workspace recovery, unpaid cancellation and inactive policy save. No provider execution or deployed readiness is claimed.</w:t>
+            </w:r>
+          </w:p>
+        </w:tc>
+      </w:tr>
+      <w:tr>
+        <w:trPr>
+          <w:cantSplit/>
+          <w:cantSplit/>
+        </w:trPr>
+        <w:tc>
+          <w:tcPr>
+            <w:tcW w:type="dxa" w:w="2563"/>
+            <w:vAlign w:val="center"/>
+            <w:shd w:fill="FFFFFF"/>
+            <w:tcMar>
+              <w:top w:w="85" w:type="dxa"/>
+              <w:left w:w="85" w:type="dxa"/>
+              <w:bottom w:w="85" w:type="dxa"/>
+              <w:right w:w="85" w:type="dxa"/>
+            </w:tcMar>
+          </w:tcPr>
+          <w:p>
+            <w:pPr>
+              <w:spacing w:after="40" w:before="40" w:line="245" w:lineRule="auto"/>
+            </w:pPr>
+            <w:r>
+              <w:rPr>
+                <w:rFonts w:ascii="Arial" w:hAnsi="Arial"/>
+                <w:b w:val="0"/>
+                <w:color w:val="000000"/>
+                <w:sz w:val="19"/>
+              </w:rPr>
+              <w:t>Visual review and documents</w:t>
+            </w:r>
+          </w:p>
+        </w:tc>
+        <w:tc>
+          <w:tcPr>
+            <w:tcW w:type="dxa" w:w="7603"/>
+            <w:vAlign w:val="center"/>
+            <w:shd w:fill="FFFFFF"/>
+            <w:tcMar>
+              <w:top w:w="85" w:type="dxa"/>
+              <w:left w:w="85" w:type="dxa"/>
+              <w:bottom w:w="85" w:type="dxa"/>
+              <w:right w:w="85" w:type="dxa"/>
+            </w:tcMar>
+          </w:tcPr>
+          <w:p>
+            <w:pPr>
+              <w:spacing w:after="40" w:before="40" w:line="245" w:lineRule="auto"/>
+            </w:pPr>
+            <w:r>
+              <w:rPr>
+                <w:rFonts w:ascii="Arial" w:hAnsi="Arial"/>
+                <w:b w:val="0"/>
+                <w:color w:val="000000"/>
+                <w:sz w:val="19"/>
+              </w:rPr>
+              <w:t>Final responsive captures are active from the frozen checked source. Inspection of every original, final guide and Word freshness checks, and the same-ID Google Docs update remain pending. Earlier captures and component fixtures retain their stated limits.</w:t>
+            </w:r>
+          </w:p>
+        </w:tc>
+      </w:tr>
+      <w:tr>
+        <w:trPr>
+          <w:cantSplit/>
+          <w:cantSplit/>
+        </w:trPr>
+        <w:tc>
+          <w:tcPr>
+            <w:tcW w:type="dxa" w:w="2563"/>
+            <w:vAlign w:val="center"/>
+            <w:shd w:fill="FFFFFF"/>
+            <w:tcMar>
+              <w:top w:w="85" w:type="dxa"/>
+              <w:left w:w="85" w:type="dxa"/>
+              <w:bottom w:w="85" w:type="dxa"/>
+              <w:right w:w="85" w:type="dxa"/>
+            </w:tcMar>
+          </w:tcPr>
+          <w:p>
+            <w:pPr>
+              <w:spacing w:after="40" w:before="40" w:line="245" w:lineRule="auto"/>
+            </w:pPr>
+            <w:r>
+              <w:rPr>
+                <w:rFonts w:ascii="Arial" w:hAnsi="Arial"/>
+                <w:b w:val="0"/>
+                <w:color w:val="000000"/>
+                <w:sz w:val="19"/>
+              </w:rPr>
+              <w:t>Deployment</w:t>
+            </w:r>
+          </w:p>
+        </w:tc>
+        <w:tc>
+          <w:tcPr>
+            <w:tcW w:type="dxa" w:w="7603"/>
+            <w:vAlign w:val="center"/>
+            <w:shd w:fill="FFFFFF"/>
+            <w:tcMar>
+              <w:top w:w="85" w:type="dxa"/>
+              <w:left w:w="85" w:type="dxa"/>
+              <w:bottom w:w="85" w:type="dxa"/>
+              <w:right w:w="85" w:type="dxa"/>
+            </w:tcMar>
+          </w:tcPr>
+          <w:p>
+            <w:pPr>
+              <w:spacing w:after="40" w:before="40" w:line="245" w:lineRule="auto"/>
+            </w:pPr>
+            <w:r>
+              <w:rPr>
+                <w:rFonts w:ascii="Arial" w:hAnsi="Arial"/>
+                <w:b w:val="0"/>
+                <w:color w:val="000000"/>
+                <w:sz w:val="19"/>
+              </w:rPr>
+              <w:t>Protected PR, hosted CI, production deployment and production smoke tests remain separate pending gates. The passing local run does not establish live readiness.</w:t>
+            </w:r>
+          </w:p>
+        </w:tc>
+      </w:tr>
+    </w:tbl>
+    <w:p>
+      <w:pPr>
+        <w:spacing w:before="140"/>
+      </w:pPr>
+      <w:r>
+        <w:t>The private credentials annex contains no admin TOTP or recovery secrets. No passwords have been added to this plan or the shared guide. The test runner suppresses automatic failure snapshots that could expose enrollment secrets; assertions, request limits and authorization checks remain active.</w:t>
+      </w:r>
+    </w:p>
+    <w:p>
+      <w:r>
+        <w:t>Email sender/inbox delivery, MSG91 approval and real SMS, Cashfree merchant and seller approval, live payment/refund/settlement, production smoke tests and native installer release have no current pass evidence. The business decision on gateway, refund and chargeback costs is also pending. Do not infer complete launch readiness from the local results.</w:t>
       </w:r>
     </w:p>
     <w:p>
@@ -3377,7 +4643,6 @@
       <w:hyperlink r:id="rId9">
         <w:r>
           <w:rPr>
-            <w:color w:val="175C73"/>
             <w:u w:val="single"/>
           </w:rPr>
           <w:t>Current requirements and approval record</w:t>
@@ -3391,10 +4656,9 @@
       <w:pPr>
         <w:pStyle w:val="ListBullet"/>
       </w:pPr>
-      <w:hyperlink r:id="rId11">
+      <w:hyperlink r:id="rId12">
         <w:r>
           <w:rPr>
-            <w:color w:val="175C73"/>
             <w:u w:val="single"/>
           </w:rPr>
           <w:t>Service setup and exact settings</w:t>
@@ -3403,10 +4667,9 @@
       <w:r>
         <w:t xml:space="preserve"> and </w:t>
       </w:r>
-      <w:hyperlink r:id="rId12">
+      <w:hyperlink r:id="rId13">
         <w:r>
           <w:rPr>
-            <w:color w:val="175C73"/>
             <w:u w:val="single"/>
           </w:rPr>
           <w:t>service inventory</w:t>
@@ -3420,10 +4683,9 @@
       <w:pPr>
         <w:pStyle w:val="ListBullet"/>
       </w:pPr>
-      <w:hyperlink r:id="rId13">
+      <w:hyperlink r:id="rId14">
         <w:r>
           <w:rPr>
-            <w:color w:val="175C73"/>
             <w:u w:val="single"/>
           </w:rPr>
           <w:t>UI acceptance contract</w:t>
@@ -3432,10 +4694,9 @@
       <w:r>
         <w:t xml:space="preserve"> and </w:t>
       </w:r>
-      <w:hyperlink r:id="rId14">
+      <w:hyperlink r:id="rId15">
         <w:r>
           <w:rPr>
-            <w:color w:val="175C73"/>
             <w:u w:val="single"/>
           </w:rPr>
           <w:t>guide update process</w:t>
@@ -3449,10 +4710,9 @@
       <w:pPr>
         <w:pStyle w:val="ListBullet"/>
       </w:pPr>
-      <w:hyperlink r:id="rId15">
+      <w:hyperlink r:id="rId16">
         <w:r>
           <w:rPr>
-            <w:color w:val="175C73"/>
             <w:u w:val="single"/>
           </w:rPr>
           <w:t>Better Auth installation</w:t>
@@ -3461,10 +4721,9 @@
       <w:r>
         <w:t xml:space="preserve"> and </w:t>
       </w:r>
-      <w:hyperlink r:id="rId16">
+      <w:hyperlink r:id="rId17">
         <w:r>
           <w:rPr>
-            <w:color w:val="175C73"/>
             <w:u w:val="single"/>
           </w:rPr>
           <w:t>Convex local deployment limits</w:t>
@@ -3478,10 +4737,9 @@
       <w:pPr>
         <w:pStyle w:val="ListBullet"/>
       </w:pPr>
-      <w:hyperlink r:id="rId17">
+      <w:hyperlink r:id="rId18">
         <w:r>
           <w:rPr>
-            <w:color w:val="175C73"/>
             <w:u w:val="single"/>
           </w:rPr>
           <w:t>Resend sender domains</w:t>
@@ -3490,10 +4748,9 @@
       <w:r>
         <w:t xml:space="preserve"> and </w:t>
       </w:r>
-      <w:hyperlink r:id="rId18">
+      <w:hyperlink r:id="rId19">
         <w:r>
           <w:rPr>
-            <w:color w:val="175C73"/>
             <w:u w:val="single"/>
           </w:rPr>
           <w:t>API keys</w:t>
@@ -3507,10 +4764,9 @@
       <w:pPr>
         <w:pStyle w:val="ListBullet"/>
       </w:pPr>
-      <w:hyperlink r:id="rId19">
+      <w:hyperlink r:id="rId20">
         <w:r>
           <w:rPr>
-            <w:color w:val="175C73"/>
             <w:u w:val="single"/>
           </w:rPr>
           <w:t>MSG91 DLT template guidance</w:t>
@@ -3519,10 +4775,9 @@
       <w:r>
         <w:t xml:space="preserve"> and </w:t>
       </w:r>
-      <w:hyperlink r:id="rId20">
+      <w:hyperlink r:id="rId21">
         <w:r>
           <w:rPr>
-            <w:color w:val="175C73"/>
             <w:u w:val="single"/>
           </w:rPr>
           <w:t>Flow template setup</w:t>
@@ -3536,10 +4791,9 @@
       <w:pPr>
         <w:pStyle w:val="ListBullet"/>
       </w:pPr>
-      <w:hyperlink r:id="rId21">
+      <w:hyperlink r:id="rId22">
         <w:r>
           <w:rPr>
-            <w:color w:val="175C73"/>
             <w:u w:val="single"/>
           </w:rPr>
           <w:t>Convex and Vercel deployment</w:t>
@@ -3553,10 +4807,9 @@
       <w:pPr>
         <w:pStyle w:val="ListBullet"/>
       </w:pPr>
-      <w:hyperlink r:id="rId22">
+      <w:hyperlink r:id="rId23">
         <w:r>
           <w:rPr>
-            <w:color w:val="175C73"/>
             <w:u w:val="single"/>
           </w:rPr>
           <w:t>Razorpay Route</w:t>
@@ -3565,27 +4818,25 @@
       <w:r>
         <w:t xml:space="preserve"> and </w:t>
       </w:r>
-      <w:hyperlink r:id="rId23">
+      <w:hyperlink r:id="rId24">
         <w:r>
           <w:rPr>
-            <w:color w:val="175C73"/>
             <w:u w:val="single"/>
           </w:rPr>
           <w:t>Cashfree Easy Split</w:t>
         </w:r>
       </w:hyperlink>
       <w:r>
-        <w:t>, examples for fit review only.</w:t>
+        <w:t>, comparison sources; Cashfree is selected, subject to provider approval.</w:t>
       </w:r>
     </w:p>
     <w:p>
       <w:pPr>
         <w:pStyle w:val="ListBullet"/>
       </w:pPr>
-      <w:hyperlink r:id="rId24">
+      <w:hyperlink r:id="rId25">
         <w:r>
           <w:rPr>
-            <w:color w:val="175C73"/>
             <w:u w:val="single"/>
           </w:rPr>
           <w:t>Expo store builds and account requirements</w:t>
@@ -3596,7 +4847,7 @@
       </w:r>
     </w:p>
     <w:sectPr>
-      <w:footerReference w:type="default" r:id="rId25"/>
+      <w:footerReference w:type="default" r:id="rId26"/>
       <w:pgSz w:w="12240" w:h="15840"/>
       <w:pgMar w:top="1008" w:right="1037" w:bottom="1008" w:left="1037" w:header="720" w:footer="720" w:gutter="0"/>
       <w:cols w:space="720"/>

</xml_diff>